<commit_message>
chore: update document template
</commit_message>
<xml_diff>
--- a/apps/web/public/договір_ФОП.docx
+++ b/apps/web/public/договір_ФОП.docx
@@ -2584,13 +2584,13 @@
               <wp:anchor xmlns:wp="http://schemas.openxmlformats.org/drawingml/2006/wordprocessingDrawing" xmlns:wp14="http://schemas.microsoft.com/office/word/2010/wordprocessingDrawing" distT="0" distB="0" distL="114300" distR="114300" simplePos="0" relativeHeight="251660288" behindDoc="0" locked="0" layoutInCell="1" allowOverlap="1">
                 <wp:simplePos x="0" y="0"/>
                 <wp:positionH relativeFrom="column">
-                  <wp:posOffset>3205017</wp:posOffset>
+                  <wp:posOffset>3048975</wp:posOffset>
                 </wp:positionH>
                 <wp:positionV relativeFrom="paragraph">
                   <wp:posOffset>508000</wp:posOffset>
                 </wp:positionV>
-                <wp:extent cx="3380509" cy="3520440"/>
-                <wp:effectExtent l="0" t="0" r="0" b="0"/>
+                <wp:extent cx="3536551" cy="3520440"/>
+                <wp:effectExtent l="3175" t="3175" r="3175" b="3175"/>
                 <wp:wrapNone/>
                 <wp:docPr id="2" name="Text Box 1"/>
                 <wp:cNvGraphicFramePr/>
@@ -2600,9 +2600,9 @@
                       <wps:cNvPr id="0" name=""/>
                       <wps:cNvSpPr txBox="1"/>
                       <wps:spPr bwMode="auto">
-                        <a:xfrm>
+                        <a:xfrm flipH="0" flipV="0">
                           <a:off x="0" y="0"/>
-                          <a:ext cx="3380509" cy="3520440"/>
+                          <a:ext cx="3536550" cy="3520440"/>
                         </a:xfrm>
                         <a:prstGeom prst="rect">
                           <a:avLst/>
@@ -2671,7 +2671,7 @@
                                 <w:sz w:val="28"/>
                                 <w:szCs w:val="28"/>
                               </w:rPr>
-                              <w:t xml:space="preserve">ФОП БУДЗИНА Наталя</w:t>
+                              <w:t xml:space="preserve">ФОП Будзина Наталя</w:t>
                             </w:r>
                             <w:r>
                               <w:rPr>
@@ -2774,23 +2774,9 @@
                                 <w:sz w:val="28"/>
                                 <w:szCs w:val="28"/>
                               </w:rPr>
-                              <w:t xml:space="preserve">пров.</w:t>
                             </w:r>
                             <w:r>
-                              <w:rPr>
-                                <w:rFonts w:ascii="Times New Roman" w:hAnsi="Times New Roman" w:cs="Times New Roman"/>
-                                <w:sz w:val="28"/>
-                                <w:szCs w:val="28"/>
-                              </w:rPr>
-                              <w:t xml:space="preserve"> </w:t>
-                            </w:r>
-                            <w:r>
-                              <w:rPr>
-                                <w:rFonts w:ascii="Times New Roman" w:hAnsi="Times New Roman" w:cs="Times New Roman"/>
-                                <w:sz w:val="28"/>
-                                <w:szCs w:val="28"/>
-                              </w:rPr>
-                              <w:t xml:space="preserve">Привокзальний 4а,</w:t>
+                              <w:t xml:space="preserve">вул. Сковороди, буд. 18</w:t>
                             </w:r>
                             <w:r>
                               <w:rPr>
@@ -2951,36 +2937,9 @@
                                 <w:sz w:val="28"/>
                                 <w:szCs w:val="28"/>
                               </w:rPr>
-                              <w:t xml:space="preserve">БАНК АТ </w:t>
                             </w:r>
                             <w:r>
-                              <w:rPr>
-                                <w:rFonts w:ascii="Times New Roman" w:hAnsi="Times New Roman" w:cs="Times New Roman"/>
-                                <w:color w:val="000000"/>
-                                <w:sz w:val="28"/>
-                                <w:szCs w:val="28"/>
-                                <w:lang w:val="ru-RU"/>
-                              </w:rPr>
-                              <w:t xml:space="preserve">“</w:t>
-                            </w:r>
-                            <w:r>
-                              <w:rPr>
-                                <w:rFonts w:ascii="Times New Roman" w:hAnsi="Times New Roman" w:cs="Times New Roman"/>
-                                <w:color w:val="000000"/>
-                                <w:sz w:val="28"/>
-                                <w:szCs w:val="28"/>
-                              </w:rPr>
-                              <w:t xml:space="preserve">УНІВЕРСАЛ БАНК</w:t>
-                            </w:r>
-                            <w:r>
-                              <w:rPr>
-                                <w:rFonts w:ascii="Times New Roman" w:hAnsi="Times New Roman" w:cs="Times New Roman"/>
-                                <w:color w:val="000000"/>
-                                <w:sz w:val="28"/>
-                                <w:szCs w:val="28"/>
-                                <w:lang w:val="ru-RU"/>
-                              </w:rPr>
-                              <w:t xml:space="preserve">”</w:t>
+                              <w:t xml:space="preserve">Банк АТ КБ «ПРИВАТ БАНК»</w:t>
                             </w:r>
                             <w:r>
                               <w:rPr>
@@ -3034,17 +2993,15 @@
                                 <w:szCs w:val="28"/>
                                 <w:lang w:val="en-US"/>
                               </w:rPr>
+                            </w:r>
+                            <w:r>
+                              <w:rPr>
+                                <w:lang w:val="en-US"/>
+                              </w:rPr>
                               <w:t xml:space="preserve">IBAN</w:t>
                             </w:r>
                             <w:r>
-                              <w:rPr>
-                                <w:rFonts w:ascii="Times New Roman" w:hAnsi="Times New Roman" w:cs="Times New Roman"/>
-                                <w:color w:val="000000"/>
-                                <w:sz w:val="28"/>
-                                <w:szCs w:val="28"/>
-                                <w:lang w:val="ru-RU"/>
-                              </w:rPr>
-                              <w:t xml:space="preserve"> </w:t>
+                              <w:t xml:space="preserve"> UA803052990000026008050043023</w:t>
                             </w:r>
                             <w:r>
                               <w:rPr>
@@ -3053,26 +3010,6 @@
                                 <w:sz w:val="28"/>
                                 <w:szCs w:val="28"/>
                                 <w:lang w:val="en-US"/>
-                              </w:rPr>
-                              <w:t xml:space="preserve">UA</w:t>
-                            </w:r>
-                            <w:r>
-                              <w:rPr>
-                                <w:rFonts w:ascii="Times New Roman" w:hAnsi="Times New Roman" w:cs="Times New Roman"/>
-                                <w:color w:val="000000"/>
-                                <w:sz w:val="28"/>
-                                <w:szCs w:val="28"/>
-                                <w:lang w:val="ru-RU"/>
-                              </w:rPr>
-                              <w:t xml:space="preserve">583220010000026006350112487</w:t>
-                            </w:r>
-                            <w:r>
-                              <w:rPr>
-                                <w:rFonts w:ascii="Helvetica Neue" w:hAnsi="Helvetica Neue" w:cs="Helvetica Neue"/>
-                                <w:color w:val="000000"/>
-                                <w:sz w:val="32"/>
-                                <w:szCs w:val="32"/>
-                                <w:lang w:val="ru-RU"/>
                               </w:rPr>
                             </w:r>
                             <w:r>
@@ -3131,15 +3068,12 @@
                     </wps:wsp>
                   </a:graphicData>
                 </a:graphic>
-                <wp14:sizeRelH relativeFrom="margin">
-                  <wp14:pctWidth>0</wp14:pctWidth>
-                </wp14:sizeRelH>
               </wp:anchor>
             </w:drawing>
           </mc:Choice>
           <mc:Fallback>
             <w:pict>
-              <v:shape id="shape 1" o:spid="_x0000_s1" o:spt="202" type="#_x0000_t202" style="position:absolute;z-index:251660288;o:allowoverlap:true;o:allowincell:true;mso-position-horizontal-relative:text;margin-left:252.36pt;mso-position-horizontal:absolute;mso-position-vertical-relative:text;margin-top:40.00pt;mso-position-vertical:absolute;width:266.18pt;height:277.20pt;mso-wrap-distance-left:9.00pt;mso-wrap-distance-top:0.00pt;mso-wrap-distance-right:9.00pt;mso-wrap-distance-bottom:0.00pt;v-text-anchor:top;visibility:visible;" fillcolor="#FFFFFF" stroked="f" strokeweight="0.50pt">
+              <v:shape id="shape 1" o:spid="_x0000_s1" o:spt="202" type="#_x0000_t202" style="position:absolute;z-index:251660288;o:allowoverlap:true;o:allowincell:true;mso-position-horizontal-relative:text;margin-left:240.08pt;mso-position-horizontal:absolute;mso-position-vertical-relative:text;margin-top:40.00pt;mso-position-vertical:absolute;width:278.47pt;height:277.20pt;mso-wrap-distance-left:9.00pt;mso-wrap-distance-top:0.00pt;mso-wrap-distance-right:9.00pt;mso-wrap-distance-bottom:0.00pt;v-text-anchor:top;visibility:visible;" fillcolor="#FFFFFF" stroked="f" strokeweight="0.50pt">
                 <v:textbox inset="0,0,0,0">
                   <w:txbxContent>
                     <w:p>
@@ -3197,7 +3131,7 @@
                           <w:sz w:val="28"/>
                           <w:szCs w:val="28"/>
                         </w:rPr>
-                        <w:t xml:space="preserve">ФОП БУДЗИНА Наталя</w:t>
+                        <w:t xml:space="preserve">ФОП Будзина Наталя</w:t>
                       </w:r>
                       <w:r>
                         <w:rPr>
@@ -3300,23 +3234,9 @@
                           <w:sz w:val="28"/>
                           <w:szCs w:val="28"/>
                         </w:rPr>
-                        <w:t xml:space="preserve">пров.</w:t>
                       </w:r>
                       <w:r>
-                        <w:rPr>
-                          <w:rFonts w:ascii="Times New Roman" w:hAnsi="Times New Roman" w:cs="Times New Roman"/>
-                          <w:sz w:val="28"/>
-                          <w:szCs w:val="28"/>
-                        </w:rPr>
-                        <w:t xml:space="preserve"> </w:t>
-                      </w:r>
-                      <w:r>
-                        <w:rPr>
-                          <w:rFonts w:ascii="Times New Roman" w:hAnsi="Times New Roman" w:cs="Times New Roman"/>
-                          <w:sz w:val="28"/>
-                          <w:szCs w:val="28"/>
-                        </w:rPr>
-                        <w:t xml:space="preserve">Привокзальний 4а,</w:t>
+                        <w:t xml:space="preserve">вул. Сковороди, буд. 18</w:t>
                       </w:r>
                       <w:r>
                         <w:rPr>
@@ -3477,36 +3397,9 @@
                           <w:sz w:val="28"/>
                           <w:szCs w:val="28"/>
                         </w:rPr>
-                        <w:t xml:space="preserve">БАНК АТ </w:t>
                       </w:r>
                       <w:r>
-                        <w:rPr>
-                          <w:rFonts w:ascii="Times New Roman" w:hAnsi="Times New Roman" w:cs="Times New Roman"/>
-                          <w:color w:val="000000"/>
-                          <w:sz w:val="28"/>
-                          <w:szCs w:val="28"/>
-                          <w:lang w:val="ru-RU"/>
-                        </w:rPr>
-                        <w:t xml:space="preserve">“</w:t>
-                      </w:r>
-                      <w:r>
-                        <w:rPr>
-                          <w:rFonts w:ascii="Times New Roman" w:hAnsi="Times New Roman" w:cs="Times New Roman"/>
-                          <w:color w:val="000000"/>
-                          <w:sz w:val="28"/>
-                          <w:szCs w:val="28"/>
-                        </w:rPr>
-                        <w:t xml:space="preserve">УНІВЕРСАЛ БАНК</w:t>
-                      </w:r>
-                      <w:r>
-                        <w:rPr>
-                          <w:rFonts w:ascii="Times New Roman" w:hAnsi="Times New Roman" w:cs="Times New Roman"/>
-                          <w:color w:val="000000"/>
-                          <w:sz w:val="28"/>
-                          <w:szCs w:val="28"/>
-                          <w:lang w:val="ru-RU"/>
-                        </w:rPr>
-                        <w:t xml:space="preserve">”</w:t>
+                        <w:t xml:space="preserve">Банк АТ КБ «ПРИВАТ БАНК»</w:t>
                       </w:r>
                       <w:r>
                         <w:rPr>
@@ -3560,17 +3453,15 @@
                           <w:szCs w:val="28"/>
                           <w:lang w:val="en-US"/>
                         </w:rPr>
+                      </w:r>
+                      <w:r>
+                        <w:rPr>
+                          <w:lang w:val="en-US"/>
+                        </w:rPr>
                         <w:t xml:space="preserve">IBAN</w:t>
                       </w:r>
                       <w:r>
-                        <w:rPr>
-                          <w:rFonts w:ascii="Times New Roman" w:hAnsi="Times New Roman" w:cs="Times New Roman"/>
-                          <w:color w:val="000000"/>
-                          <w:sz w:val="28"/>
-                          <w:szCs w:val="28"/>
-                          <w:lang w:val="ru-RU"/>
-                        </w:rPr>
-                        <w:t xml:space="preserve"> </w:t>
+                        <w:t xml:space="preserve"> UA803052990000026008050043023</w:t>
                       </w:r>
                       <w:r>
                         <w:rPr>
@@ -3579,26 +3470,6 @@
                           <w:sz w:val="28"/>
                           <w:szCs w:val="28"/>
                           <w:lang w:val="en-US"/>
-                        </w:rPr>
-                        <w:t xml:space="preserve">UA</w:t>
-                      </w:r>
-                      <w:r>
-                        <w:rPr>
-                          <w:rFonts w:ascii="Times New Roman" w:hAnsi="Times New Roman" w:cs="Times New Roman"/>
-                          <w:color w:val="000000"/>
-                          <w:sz w:val="28"/>
-                          <w:szCs w:val="28"/>
-                          <w:lang w:val="ru-RU"/>
-                        </w:rPr>
-                        <w:t xml:space="preserve">583220010000026006350112487</w:t>
-                      </w:r>
-                      <w:r>
-                        <w:rPr>
-                          <w:rFonts w:ascii="Helvetica Neue" w:hAnsi="Helvetica Neue" w:cs="Helvetica Neue"/>
-                          <w:color w:val="000000"/>
-                          <w:sz w:val="32"/>
-                          <w:szCs w:val="32"/>
-                          <w:lang w:val="ru-RU"/>
                         </w:rPr>
                       </w:r>
                       <w:r>

</xml_diff>